<commit_message>
Gantt con las dos funciones (643 h) y la prueba del 17/10 en el telar
Tres tareas nuevas en la Etapa 07, cargadas en la planilla del Drive (7,12 a
7,14), y las fechas reales de 7,4 a 7,6. Con 643 horas el presupuesto pasa a
$40.095.441 (costo $32.076.353, ganancia $8.019.088): Estimación,
Modalidad, Documentación de Proyecto, sitio y figuras 11 y 13.

La prueba del 17/10/2026, en protoboard: el lector se alimenta con 15 a
30 V (resistencia de protección de 470 Ω 3 W), el sensor de pasada quedó
conectado y calibrado, y el primer canal seleccionó bien. Se registra en la
Bitácora, el Estado completo, la Documentación, las guías, las planillas,
los manuales y los Markdown.

Co-Authored-By: Claude Opus 5.5 <noreply@anthropic.com>
Claude-Session: https://claude.ai/code/session_01QiY8ZZNAM9gwPKiqSkCaaj
</commit_message>
<xml_diff>
--- a/docs/analisis/Componentes_Completos_Control_Trama.docx
+++ b/docs/analisis/Componentes_Completos_Control_Trama.docx
@@ -1827,7 +1827,7 @@
                 <w:sz w:val="20"/>
                 <w:szCs w:val="20"/>
               </w:rPr>
-              <w:t xml:space="preserve">Resistencia de protección (220 Ω 2 W o 470 Ω 3 W)</w:t>
+              <w:t xml:space="preserve">Resistencia de protección 470 Ω 3 W</w:t>
             </w:r>
           </w:p>
         </w:tc>
@@ -1853,7 +1853,7 @@
                 <w:sz w:val="20"/>
                 <w:szCs w:val="20"/>
               </w:rPr>
-              <w:t xml:space="preserve">Lado del telar, del + del conector del lector a la pata 4: limita la corriente ante un error de cableado. 220 Ω 2 W si el lector se alimenta con hasta 15 V; 470 Ω 3 W de 15 a 30 V.</w:t>
+              <w:t xml:space="preserve">Lado del telar, del + del conector del lector a la pata 4: limita la corriente ante un error de cableado. 470 Ω 3 W: el lector del C 201 se alimenta con 15 a 30 V (17/10/2026).</w:t>
             </w:r>
           </w:p>
         </w:tc>
@@ -2531,7 +2531,7 @@
           <w:sz w:val="21"/>
           <w:szCs w:val="21"/>
         </w:rPr>
-        <w:t xml:space="preserve">Antes de conectar los cuatro LCA110, medir un lector óptico: la alimentación (que elige la resistencia de protección), qué hace la señal con agujero y la corriente con la resistencia de protección en serie (Guia_Conexion_Reles_LCA110.docx).</w:t>
+        <w:t xml:space="preserve">Antes de conectar cada LCA110, medir su lector óptico: la alimentación (que elige la resistencia de protección), qué hace la señal con agujero y la corriente con la resistencia de protección en serie (Guia_Conexion_Reles_LCA110.docx). El primero se midió el 17/10/2026: entre 15 y 30 V, así que van las de 470 Ω 3 W.</w:t>
       </w:r>
     </w:p>
     <w:p>

</xml_diff>

<commit_message>
Documentación: pull-up interna en GPIO 32 y 33 del sensado
Los Word (con sus PDF), las planillas, los diagramas, los Markdown del firmware y la
verificación dicen lo mismo que el firmware: el 32 y el 33 usan la pull-up interna del
ESP32 y solo el 34 lleva su 10 kΩ. Las 6 resistencias compradas quedan 4 en uso y 2 de
repuesto, sin cambio de costos. Entrada del 21/10 en la Bitácora.

Co-Authored-By: Claude Opus 5.5 <noreply@anthropic.com>
Claude-Session: https://claude.ai/code/session_01QiY8ZZNAM9gwPKiqSkCaaj
</commit_message>
<xml_diff>
--- a/docs/analisis/Componentes_Completos_Control_Trama.docx
+++ b/docs/analisis/Componentes_Completos_Control_Trama.docx
@@ -1042,7 +1042,7 @@
                 <w:sz w:val="18"/>
                 <w:szCs w:val="18"/>
               </w:rPr>
-              <w:t xml:space="preserve">Arranque seguro y lectura del sensado: pull-up a 3,3 V en GPIO 25 y 26 y en los 3 de sensado; la de GPIO 27 va a GND porque su módulo es activo-alto.</w:t>
+              <w:t xml:space="preserve">Arranque seguro y lectura del sensado: pull-up a 3,3 V en GPIO 25 y 26 y en el GPIO 34 de sensado (el 32 y el 33 usan la pull-up interna del ESP32); la de GPIO 27 va a GND porque su módulo es activo-alto.</w:t>
             </w:r>
           </w:p>
         </w:tc>
@@ -1068,7 +1068,7 @@
                 <w:sz w:val="18"/>
                 <w:szCs w:val="18"/>
               </w:rPr>
-              <w:t xml:space="preserve">6</w:t>
+              <w:t xml:space="preserve">4</w:t>
             </w:r>
           </w:p>
         </w:tc>

</xml_diff>